<commit_message>
Enhance chat.html and index.html by adding a new unit scheme selection for turbine configurations, improving user input options. Update main.py to include unit scheme handling in simulation requests and document generation, ensuring accurate output for both pressure difference and EC turbine designs. Modify PPT generation logic to accommodate different templates based on the selected unit scheme, enhancing the technical documentation output.
</commit_message>
<xml_diff>
--- a/models/RE_template.docx
+++ b/models/RE_template.docx
@@ -50,22 +50,6 @@
         <w:gridCol w:w="1966"/>
       </w:tblGrid>
       <w:tr>
-        <w:tblPrEx>
-          <w:tblBorders>
-            <w:top w:val="single" w:color="auto" w:sz="12" w:space="0"/>
-            <w:left w:val="single" w:color="auto" w:sz="12" w:space="0"/>
-            <w:bottom w:val="single" w:color="auto" w:sz="12" w:space="0"/>
-            <w:right w:val="single" w:color="auto" w:sz="12" w:space="0"/>
-            <w:insideH w:val="single" w:color="auto" w:sz="2" w:space="0"/>
-            <w:insideV w:val="single" w:color="auto" w:sz="2" w:space="0"/>
-          </w:tblBorders>
-          <w:tblCellMar>
-            <w:top w:w="0" w:type="dxa"/>
-            <w:left w:w="0" w:type="dxa"/>
-            <w:bottom w:w="0" w:type="dxa"/>
-            <w:right w:w="0" w:type="dxa"/>
-          </w:tblCellMar>
-        </w:tblPrEx>
         <w:trPr>
           <w:trHeight w:val="482" w:hRule="atLeast"/>
           <w:jc w:val="center"/>
@@ -196,22 +180,6 @@
         </w:tc>
       </w:tr>
       <w:tr>
-        <w:tblPrEx>
-          <w:tblBorders>
-            <w:top w:val="single" w:color="auto" w:sz="12" w:space="0"/>
-            <w:left w:val="single" w:color="auto" w:sz="12" w:space="0"/>
-            <w:bottom w:val="single" w:color="auto" w:sz="12" w:space="0"/>
-            <w:right w:val="single" w:color="auto" w:sz="12" w:space="0"/>
-            <w:insideH w:val="single" w:color="auto" w:sz="2" w:space="0"/>
-            <w:insideV w:val="single" w:color="auto" w:sz="2" w:space="0"/>
-          </w:tblBorders>
-          <w:tblCellMar>
-            <w:top w:w="0" w:type="dxa"/>
-            <w:left w:w="0" w:type="dxa"/>
-            <w:bottom w:w="0" w:type="dxa"/>
-            <w:right w:w="0" w:type="dxa"/>
-          </w:tblCellMar>
-        </w:tblPrEx>
         <w:trPr>
           <w:trHeight w:val="482" w:hRule="atLeast"/>
           <w:jc w:val="center"/>
@@ -330,7 +298,7 @@
                 <w:tab w:val="clear" w:pos="5040"/>
               </w:tabs>
               <w:spacing w:after="0" w:line="360" w:lineRule="exact"/>
-              <w:ind w:left="718" w:hanging="718" w:hangingChars="298"/>
+              <w:ind w:left="718" w:hanging="716" w:hangingChars="298"/>
               <w:jc w:val="center"/>
               <w:rPr>
                 <w:rFonts w:ascii="Times New Roman" w:hAnsi="Times New Roman" w:eastAsia="宋体"/>
@@ -362,22 +330,6 @@
         </w:tc>
       </w:tr>
       <w:tr>
-        <w:tblPrEx>
-          <w:tblBorders>
-            <w:top w:val="single" w:color="auto" w:sz="12" w:space="0"/>
-            <w:left w:val="single" w:color="auto" w:sz="12" w:space="0"/>
-            <w:bottom w:val="single" w:color="auto" w:sz="12" w:space="0"/>
-            <w:right w:val="single" w:color="auto" w:sz="12" w:space="0"/>
-            <w:insideH w:val="single" w:color="auto" w:sz="2" w:space="0"/>
-            <w:insideV w:val="single" w:color="auto" w:sz="2" w:space="0"/>
-          </w:tblBorders>
-          <w:tblCellMar>
-            <w:top w:w="0" w:type="dxa"/>
-            <w:left w:w="0" w:type="dxa"/>
-            <w:bottom w:w="0" w:type="dxa"/>
-            <w:right w:w="0" w:type="dxa"/>
-          </w:tblCellMar>
-        </w:tblPrEx>
         <w:trPr>
           <w:trHeight w:val="482" w:hRule="atLeast"/>
           <w:jc w:val="center"/>
@@ -498,7 +450,7 @@
                 <w:tab w:val="clear" w:pos="5040"/>
               </w:tabs>
               <w:spacing w:after="0" w:line="360" w:lineRule="exact"/>
-              <w:ind w:left="718" w:hanging="718" w:hangingChars="298"/>
+              <w:ind w:left="718" w:hanging="716" w:hangingChars="298"/>
               <w:jc w:val="center"/>
               <w:rPr>
                 <w:rFonts w:ascii="Times New Roman" w:hAnsi="Times New Roman" w:eastAsia="宋体"/>
@@ -530,22 +482,6 @@
         </w:tc>
       </w:tr>
       <w:tr>
-        <w:tblPrEx>
-          <w:tblBorders>
-            <w:top w:val="single" w:color="auto" w:sz="12" w:space="0"/>
-            <w:left w:val="single" w:color="auto" w:sz="12" w:space="0"/>
-            <w:bottom w:val="single" w:color="auto" w:sz="12" w:space="0"/>
-            <w:right w:val="single" w:color="auto" w:sz="12" w:space="0"/>
-            <w:insideH w:val="single" w:color="auto" w:sz="2" w:space="0"/>
-            <w:insideV w:val="single" w:color="auto" w:sz="2" w:space="0"/>
-          </w:tblBorders>
-          <w:tblCellMar>
-            <w:top w:w="0" w:type="dxa"/>
-            <w:left w:w="0" w:type="dxa"/>
-            <w:bottom w:w="0" w:type="dxa"/>
-            <w:right w:w="0" w:type="dxa"/>
-          </w:tblCellMar>
-        </w:tblPrEx>
         <w:trPr>
           <w:trHeight w:val="482" w:hRule="atLeast"/>
           <w:jc w:val="center"/>
@@ -664,7 +600,7 @@
                 <w:tab w:val="clear" w:pos="5040"/>
               </w:tabs>
               <w:spacing w:after="0" w:line="360" w:lineRule="exact"/>
-              <w:ind w:left="718" w:hanging="718" w:hangingChars="298"/>
+              <w:ind w:left="718" w:hanging="716" w:hangingChars="298"/>
               <w:jc w:val="center"/>
               <w:rPr>
                 <w:rFonts w:ascii="Times New Roman" w:hAnsi="Times New Roman" w:eastAsia="宋体"/>
@@ -682,22 +618,6 @@
         </w:tc>
       </w:tr>
       <w:tr>
-        <w:tblPrEx>
-          <w:tblBorders>
-            <w:top w:val="single" w:color="auto" w:sz="12" w:space="0"/>
-            <w:left w:val="single" w:color="auto" w:sz="12" w:space="0"/>
-            <w:bottom w:val="single" w:color="auto" w:sz="12" w:space="0"/>
-            <w:right w:val="single" w:color="auto" w:sz="12" w:space="0"/>
-            <w:insideH w:val="single" w:color="auto" w:sz="2" w:space="0"/>
-            <w:insideV w:val="single" w:color="auto" w:sz="2" w:space="0"/>
-          </w:tblBorders>
-          <w:tblCellMar>
-            <w:top w:w="0" w:type="dxa"/>
-            <w:left w:w="0" w:type="dxa"/>
-            <w:bottom w:w="0" w:type="dxa"/>
-            <w:right w:w="0" w:type="dxa"/>
-          </w:tblCellMar>
-        </w:tblPrEx>
         <w:trPr>
           <w:trHeight w:val="482" w:hRule="atLeast"/>
           <w:jc w:val="center"/>
@@ -758,7 +678,7 @@
                 <w:tab w:val="clear" w:pos="5040"/>
               </w:tabs>
               <w:spacing w:after="0" w:line="240" w:lineRule="auto"/>
-              <w:ind w:left="718" w:hanging="718" w:hangingChars="298"/>
+              <w:ind w:left="718" w:hanging="716" w:hangingChars="298"/>
               <w:jc w:val="center"/>
               <w:rPr>
                 <w:rFonts w:ascii="Times New Roman" w:hAnsi="Times New Roman" w:eastAsia="宋体"/>
@@ -790,7 +710,7 @@
                 <w:tab w:val="clear" w:pos="5040"/>
               </w:tabs>
               <w:spacing w:after="0" w:line="360" w:lineRule="exact"/>
-              <w:ind w:left="718" w:hanging="718" w:hangingChars="298"/>
+              <w:ind w:left="718" w:hanging="716" w:hangingChars="298"/>
               <w:jc w:val="center"/>
               <w:rPr>
                 <w:rFonts w:ascii="Times New Roman" w:hAnsi="Times New Roman" w:eastAsia="宋体"/>
@@ -873,22 +793,6 @@
         </w:tc>
       </w:tr>
       <w:tr>
-        <w:tblPrEx>
-          <w:tblBorders>
-            <w:top w:val="single" w:color="auto" w:sz="12" w:space="0"/>
-            <w:left w:val="single" w:color="auto" w:sz="12" w:space="0"/>
-            <w:bottom w:val="single" w:color="auto" w:sz="12" w:space="0"/>
-            <w:right w:val="single" w:color="auto" w:sz="12" w:space="0"/>
-            <w:insideH w:val="single" w:color="auto" w:sz="2" w:space="0"/>
-            <w:insideV w:val="single" w:color="auto" w:sz="2" w:space="0"/>
-          </w:tblBorders>
-          <w:tblCellMar>
-            <w:top w:w="0" w:type="dxa"/>
-            <w:left w:w="0" w:type="dxa"/>
-            <w:bottom w:w="0" w:type="dxa"/>
-            <w:right w:w="0" w:type="dxa"/>
-          </w:tblCellMar>
-        </w:tblPrEx>
         <w:trPr>
           <w:trHeight w:val="8222" w:hRule="atLeast"/>
           <w:jc w:val="center"/>
@@ -1018,22 +922,6 @@
         </w:tc>
       </w:tr>
       <w:tr>
-        <w:tblPrEx>
-          <w:tblBorders>
-            <w:top w:val="single" w:color="auto" w:sz="12" w:space="0"/>
-            <w:left w:val="single" w:color="auto" w:sz="12" w:space="0"/>
-            <w:bottom w:val="single" w:color="auto" w:sz="12" w:space="0"/>
-            <w:right w:val="single" w:color="auto" w:sz="12" w:space="0"/>
-            <w:insideH w:val="single" w:color="auto" w:sz="2" w:space="0"/>
-            <w:insideV w:val="single" w:color="auto" w:sz="2" w:space="0"/>
-          </w:tblBorders>
-          <w:tblCellMar>
-            <w:top w:w="0" w:type="dxa"/>
-            <w:left w:w="0" w:type="dxa"/>
-            <w:bottom w:w="0" w:type="dxa"/>
-            <w:right w:w="0" w:type="dxa"/>
-          </w:tblCellMar>
-        </w:tblPrEx>
         <w:trPr>
           <w:trHeight w:val="482" w:hRule="atLeast"/>
           <w:jc w:val="center"/>
@@ -1208,22 +1096,6 @@
         </w:tc>
       </w:tr>
       <w:tr>
-        <w:tblPrEx>
-          <w:tblBorders>
-            <w:top w:val="single" w:color="auto" w:sz="12" w:space="0"/>
-            <w:left w:val="single" w:color="auto" w:sz="12" w:space="0"/>
-            <w:bottom w:val="single" w:color="auto" w:sz="12" w:space="0"/>
-            <w:right w:val="single" w:color="auto" w:sz="12" w:space="0"/>
-            <w:insideH w:val="single" w:color="auto" w:sz="2" w:space="0"/>
-            <w:insideV w:val="single" w:color="auto" w:sz="2" w:space="0"/>
-          </w:tblBorders>
-          <w:tblCellMar>
-            <w:top w:w="0" w:type="dxa"/>
-            <w:left w:w="0" w:type="dxa"/>
-            <w:bottom w:w="0" w:type="dxa"/>
-            <w:right w:w="0" w:type="dxa"/>
-          </w:tblCellMar>
-        </w:tblPrEx>
         <w:trPr>
           <w:trHeight w:val="482" w:hRule="atLeast"/>
           <w:jc w:val="center"/>
@@ -1398,22 +1270,6 @@
         </w:tc>
       </w:tr>
       <w:tr>
-        <w:tblPrEx>
-          <w:tblBorders>
-            <w:top w:val="single" w:color="auto" w:sz="12" w:space="0"/>
-            <w:left w:val="single" w:color="auto" w:sz="12" w:space="0"/>
-            <w:bottom w:val="single" w:color="auto" w:sz="12" w:space="0"/>
-            <w:right w:val="single" w:color="auto" w:sz="12" w:space="0"/>
-            <w:insideH w:val="single" w:color="auto" w:sz="2" w:space="0"/>
-            <w:insideV w:val="single" w:color="auto" w:sz="2" w:space="0"/>
-          </w:tblBorders>
-          <w:tblCellMar>
-            <w:top w:w="0" w:type="dxa"/>
-            <w:left w:w="0" w:type="dxa"/>
-            <w:bottom w:w="0" w:type="dxa"/>
-            <w:right w:w="0" w:type="dxa"/>
-          </w:tblCellMar>
-        </w:tblPrEx>
         <w:trPr>
           <w:trHeight w:val="482" w:hRule="atLeast"/>
           <w:jc w:val="center"/>
@@ -1588,22 +1444,6 @@
         </w:tc>
       </w:tr>
       <w:tr>
-        <w:tblPrEx>
-          <w:tblBorders>
-            <w:top w:val="single" w:color="auto" w:sz="12" w:space="0"/>
-            <w:left w:val="single" w:color="auto" w:sz="12" w:space="0"/>
-            <w:bottom w:val="single" w:color="auto" w:sz="12" w:space="0"/>
-            <w:right w:val="single" w:color="auto" w:sz="12" w:space="0"/>
-            <w:insideH w:val="single" w:color="auto" w:sz="2" w:space="0"/>
-            <w:insideV w:val="single" w:color="auto" w:sz="2" w:space="0"/>
-          </w:tblBorders>
-          <w:tblCellMar>
-            <w:top w:w="0" w:type="dxa"/>
-            <w:left w:w="0" w:type="dxa"/>
-            <w:bottom w:w="0" w:type="dxa"/>
-            <w:right w:w="0" w:type="dxa"/>
-          </w:tblCellMar>
-        </w:tblPrEx>
         <w:trPr>
           <w:trHeight w:val="482" w:hRule="atLeast"/>
           <w:jc w:val="center"/>
@@ -1778,22 +1618,6 @@
         </w:tc>
       </w:tr>
       <w:tr>
-        <w:tblPrEx>
-          <w:tblBorders>
-            <w:top w:val="single" w:color="auto" w:sz="12" w:space="0"/>
-            <w:left w:val="single" w:color="auto" w:sz="12" w:space="0"/>
-            <w:bottom w:val="single" w:color="auto" w:sz="12" w:space="0"/>
-            <w:right w:val="single" w:color="auto" w:sz="12" w:space="0"/>
-            <w:insideH w:val="single" w:color="auto" w:sz="2" w:space="0"/>
-            <w:insideV w:val="single" w:color="auto" w:sz="2" w:space="0"/>
-          </w:tblBorders>
-          <w:tblCellMar>
-            <w:top w:w="0" w:type="dxa"/>
-            <w:left w:w="0" w:type="dxa"/>
-            <w:bottom w:w="0" w:type="dxa"/>
-            <w:right w:w="0" w:type="dxa"/>
-          </w:tblCellMar>
-        </w:tblPrEx>
         <w:trPr>
           <w:trHeight w:val="482" w:hRule="atLeast"/>
           <w:jc w:val="center"/>
@@ -2026,22 +1850,6 @@
         </w:tc>
       </w:tr>
       <w:tr>
-        <w:tblPrEx>
-          <w:tblBorders>
-            <w:top w:val="single" w:color="auto" w:sz="12" w:space="0"/>
-            <w:left w:val="single" w:color="auto" w:sz="12" w:space="0"/>
-            <w:bottom w:val="single" w:color="auto" w:sz="12" w:space="0"/>
-            <w:right w:val="single" w:color="auto" w:sz="12" w:space="0"/>
-            <w:insideH w:val="single" w:color="auto" w:sz="2" w:space="0"/>
-            <w:insideV w:val="single" w:color="auto" w:sz="2" w:space="0"/>
-          </w:tblBorders>
-          <w:tblCellMar>
-            <w:top w:w="0" w:type="dxa"/>
-            <w:left w:w="0" w:type="dxa"/>
-            <w:bottom w:w="0" w:type="dxa"/>
-            <w:right w:w="0" w:type="dxa"/>
-          </w:tblCellMar>
-        </w:tblPrEx>
         <w:trPr>
           <w:trHeight w:val="482" w:hRule="atLeast"/>
           <w:jc w:val="center"/>
@@ -2381,22 +2189,6 @@
         <w:gridCol w:w="4029"/>
       </w:tblGrid>
       <w:tr>
-        <w:tblPrEx>
-          <w:tblBorders>
-            <w:top w:val="single" w:color="000000" w:sz="6" w:space="0"/>
-            <w:left w:val="single" w:color="000000" w:sz="6" w:space="0"/>
-            <w:bottom w:val="single" w:color="000000" w:sz="6" w:space="0"/>
-            <w:right w:val="single" w:color="000000" w:sz="6" w:space="0"/>
-            <w:insideH w:val="single" w:color="000000" w:sz="6" w:space="0"/>
-            <w:insideV w:val="single" w:color="000000" w:sz="6" w:space="0"/>
-          </w:tblBorders>
-          <w:tblCellMar>
-            <w:top w:w="0" w:type="dxa"/>
-            <w:left w:w="0" w:type="dxa"/>
-            <w:bottom w:w="0" w:type="dxa"/>
-            <w:right w:w="0" w:type="dxa"/>
-          </w:tblCellMar>
-        </w:tblPrEx>
         <w:trPr>
           <w:trHeight w:val="288" w:hRule="atLeast"/>
         </w:trPr>
@@ -2582,22 +2374,6 @@
         </w:tc>
       </w:tr>
       <w:tr>
-        <w:tblPrEx>
-          <w:tblBorders>
-            <w:top w:val="single" w:color="000000" w:sz="6" w:space="0"/>
-            <w:left w:val="single" w:color="000000" w:sz="6" w:space="0"/>
-            <w:bottom w:val="single" w:color="000000" w:sz="6" w:space="0"/>
-            <w:right w:val="single" w:color="000000" w:sz="6" w:space="0"/>
-            <w:insideH w:val="single" w:color="000000" w:sz="6" w:space="0"/>
-            <w:insideV w:val="single" w:color="000000" w:sz="6" w:space="0"/>
-          </w:tblBorders>
-          <w:tblCellMar>
-            <w:top w:w="0" w:type="dxa"/>
-            <w:left w:w="0" w:type="dxa"/>
-            <w:bottom w:w="0" w:type="dxa"/>
-            <w:right w:w="0" w:type="dxa"/>
-          </w:tblCellMar>
-        </w:tblPrEx>
         <w:trPr>
           <w:trHeight w:val="281" w:hRule="atLeast"/>
         </w:trPr>
@@ -2787,22 +2563,6 @@
         </w:tc>
       </w:tr>
       <w:tr>
-        <w:tblPrEx>
-          <w:tblBorders>
-            <w:top w:val="single" w:color="000000" w:sz="6" w:space="0"/>
-            <w:left w:val="single" w:color="000000" w:sz="6" w:space="0"/>
-            <w:bottom w:val="single" w:color="000000" w:sz="6" w:space="0"/>
-            <w:right w:val="single" w:color="000000" w:sz="6" w:space="0"/>
-            <w:insideH w:val="single" w:color="000000" w:sz="6" w:space="0"/>
-            <w:insideV w:val="single" w:color="000000" w:sz="6" w:space="0"/>
-          </w:tblBorders>
-          <w:tblCellMar>
-            <w:top w:w="0" w:type="dxa"/>
-            <w:left w:w="0" w:type="dxa"/>
-            <w:bottom w:w="0" w:type="dxa"/>
-            <w:right w:w="0" w:type="dxa"/>
-          </w:tblCellMar>
-        </w:tblPrEx>
         <w:trPr>
           <w:trHeight w:val="288" w:hRule="atLeast"/>
         </w:trPr>
@@ -2959,22 +2719,6 @@
         </w:tc>
       </w:tr>
       <w:tr>
-        <w:tblPrEx>
-          <w:tblBorders>
-            <w:top w:val="single" w:color="000000" w:sz="6" w:space="0"/>
-            <w:left w:val="single" w:color="000000" w:sz="6" w:space="0"/>
-            <w:bottom w:val="single" w:color="000000" w:sz="6" w:space="0"/>
-            <w:right w:val="single" w:color="000000" w:sz="6" w:space="0"/>
-            <w:insideH w:val="single" w:color="000000" w:sz="6" w:space="0"/>
-            <w:insideV w:val="single" w:color="000000" w:sz="6" w:space="0"/>
-          </w:tblBorders>
-          <w:tblCellMar>
-            <w:top w:w="0" w:type="dxa"/>
-            <w:left w:w="0" w:type="dxa"/>
-            <w:bottom w:w="0" w:type="dxa"/>
-            <w:right w:w="0" w:type="dxa"/>
-          </w:tblCellMar>
-        </w:tblPrEx>
         <w:trPr>
           <w:trHeight w:val="288" w:hRule="atLeast"/>
         </w:trPr>
@@ -3130,22 +2874,6 @@
         </w:tc>
       </w:tr>
       <w:tr>
-        <w:tblPrEx>
-          <w:tblBorders>
-            <w:top w:val="single" w:color="000000" w:sz="6" w:space="0"/>
-            <w:left w:val="single" w:color="000000" w:sz="6" w:space="0"/>
-            <w:bottom w:val="single" w:color="000000" w:sz="6" w:space="0"/>
-            <w:right w:val="single" w:color="000000" w:sz="6" w:space="0"/>
-            <w:insideH w:val="single" w:color="000000" w:sz="6" w:space="0"/>
-            <w:insideV w:val="single" w:color="000000" w:sz="6" w:space="0"/>
-          </w:tblBorders>
-          <w:tblCellMar>
-            <w:top w:w="0" w:type="dxa"/>
-            <w:left w:w="0" w:type="dxa"/>
-            <w:bottom w:w="0" w:type="dxa"/>
-            <w:right w:w="0" w:type="dxa"/>
-          </w:tblCellMar>
-        </w:tblPrEx>
         <w:trPr>
           <w:trHeight w:val="288" w:hRule="atLeast"/>
         </w:trPr>
@@ -3301,22 +3029,6 @@
         </w:tc>
       </w:tr>
       <w:tr>
-        <w:tblPrEx>
-          <w:tblBorders>
-            <w:top w:val="single" w:color="000000" w:sz="6" w:space="0"/>
-            <w:left w:val="single" w:color="000000" w:sz="6" w:space="0"/>
-            <w:bottom w:val="single" w:color="000000" w:sz="6" w:space="0"/>
-            <w:right w:val="single" w:color="000000" w:sz="6" w:space="0"/>
-            <w:insideH w:val="single" w:color="000000" w:sz="6" w:space="0"/>
-            <w:insideV w:val="single" w:color="000000" w:sz="6" w:space="0"/>
-          </w:tblBorders>
-          <w:tblCellMar>
-            <w:top w:w="0" w:type="dxa"/>
-            <w:left w:w="0" w:type="dxa"/>
-            <w:bottom w:w="0" w:type="dxa"/>
-            <w:right w:w="0" w:type="dxa"/>
-          </w:tblCellMar>
-        </w:tblPrEx>
         <w:trPr>
           <w:trHeight w:val="288" w:hRule="atLeast"/>
         </w:trPr>
@@ -3414,7 +3126,33 @@
             </w14:solidFill>
           </w14:textFill>
         </w:rPr>
-        <w:t>级1台透平膨胀机。运行期间，机组由单个撬块组成，进气压力</w:t>
+        <w:t>级</w:t>
+      </w:r>
+      <w:r>
+        <w:rPr>
+          <w:rFonts w:hint="default"/>
+          <w:color w:val="000000" w:themeColor="text1"/>
+          <w:sz w:val="24"/>
+          <w:lang w:val="en-US"/>
+          <w14:textFill>
+            <w14:solidFill>
+              <w14:schemeClr w14:val="tx1"/>
+            </w14:solidFill>
+          </w14:textFill>
+        </w:rPr>
+        <w:t>auto_aspen_8</w:t>
+      </w:r>
+      <w:r>
+        <w:rPr>
+          <w:color w:val="000000" w:themeColor="text1"/>
+          <w:sz w:val="24"/>
+          <w14:textFill>
+            <w14:solidFill>
+              <w14:schemeClr w14:val="tx1"/>
+            </w14:solidFill>
+          </w14:textFill>
+        </w:rPr>
+        <w:t>台透平膨胀机。运行期间，机组由单个撬块组成，进气压力</w:t>
       </w:r>
       <w:r>
         <w:rPr>
@@ -3563,22 +3301,6 @@
         <w:gridCol w:w="9174"/>
       </w:tblGrid>
       <w:tr>
-        <w:tblPrEx>
-          <w:tblBorders>
-            <w:top w:val="none" w:color="auto" w:sz="0" w:space="0"/>
-            <w:left w:val="none" w:color="auto" w:sz="0" w:space="0"/>
-            <w:bottom w:val="none" w:color="auto" w:sz="0" w:space="0"/>
-            <w:right w:val="none" w:color="auto" w:sz="0" w:space="0"/>
-            <w:insideH w:val="none" w:color="auto" w:sz="0" w:space="0"/>
-            <w:insideV w:val="none" w:color="auto" w:sz="0" w:space="0"/>
-          </w:tblBorders>
-          <w:tblCellMar>
-            <w:top w:w="0" w:type="dxa"/>
-            <w:left w:w="108" w:type="dxa"/>
-            <w:bottom w:w="0" w:type="dxa"/>
-            <w:right w:w="108" w:type="dxa"/>
-          </w:tblCellMar>
-        </w:tblPrEx>
         <w:tc>
           <w:tcPr>
             <w:tcW w:w="9174" w:type="dxa"/>
@@ -3631,22 +3353,6 @@
         </w:tc>
       </w:tr>
       <w:tr>
-        <w:tblPrEx>
-          <w:tblBorders>
-            <w:top w:val="none" w:color="auto" w:sz="0" w:space="0"/>
-            <w:left w:val="none" w:color="auto" w:sz="0" w:space="0"/>
-            <w:bottom w:val="none" w:color="auto" w:sz="0" w:space="0"/>
-            <w:right w:val="none" w:color="auto" w:sz="0" w:space="0"/>
-            <w:insideH w:val="none" w:color="auto" w:sz="0" w:space="0"/>
-            <w:insideV w:val="none" w:color="auto" w:sz="0" w:space="0"/>
-          </w:tblBorders>
-          <w:tblCellMar>
-            <w:top w:w="0" w:type="dxa"/>
-            <w:left w:w="108" w:type="dxa"/>
-            <w:bottom w:w="0" w:type="dxa"/>
-            <w:right w:w="108" w:type="dxa"/>
-          </w:tblCellMar>
-        </w:tblPrEx>
         <w:tc>
           <w:tcPr>
             <w:tcW w:w="9174" w:type="dxa"/>
@@ -3706,7 +3412,21 @@
             </w14:solidFill>
           </w14:textFill>
         </w:rPr>
-        <w:t>减压发电机组可采用轴驱压缩机、轴驱发电机等方式回收气体经减压后释放的能量，其中减压发电是目前较为常用的一种方式，下文是对减压发电方案的测算：</w:t>
+        <w:t>减压发电机组可采用轴驱压缩机、轴驱发电机等方式回收气体经减压后释放的能量，其中减压发电是目前较为常用的一种方式，下文是对减压发电方案的</w:t>
+      </w:r>
+      <w:bookmarkStart w:id="1" w:name="_GoBack"/>
+      <w:bookmarkEnd w:id="1"/>
+      <w:r>
+        <w:rPr>
+          <w:color w:val="000000" w:themeColor="text1"/>
+          <w:sz w:val="24"/>
+          <w14:textFill>
+            <w14:solidFill>
+              <w14:schemeClr w14:val="tx1"/>
+            </w14:solidFill>
+          </w14:textFill>
+        </w:rPr>
+        <w:t>测算：</w:t>
       </w:r>
     </w:p>
     <w:p>
@@ -3885,22 +3605,6 @@
         <w:gridCol w:w="4757"/>
       </w:tblGrid>
       <w:tr>
-        <w:tblPrEx>
-          <w:tblBorders>
-            <w:top w:val="single" w:color="auto" w:sz="4" w:space="0"/>
-            <w:left w:val="single" w:color="auto" w:sz="4" w:space="0"/>
-            <w:bottom w:val="single" w:color="auto" w:sz="4" w:space="0"/>
-            <w:right w:val="single" w:color="auto" w:sz="4" w:space="0"/>
-            <w:insideH w:val="single" w:color="auto" w:sz="4" w:space="0"/>
-            <w:insideV w:val="single" w:color="auto" w:sz="4" w:space="0"/>
-          </w:tblBorders>
-          <w:tblCellMar>
-            <w:top w:w="0" w:type="dxa"/>
-            <w:left w:w="108" w:type="dxa"/>
-            <w:bottom w:w="0" w:type="dxa"/>
-            <w:right w:w="108" w:type="dxa"/>
-          </w:tblCellMar>
-        </w:tblPrEx>
         <w:trPr>
           <w:trHeight w:val="390" w:hRule="atLeast"/>
           <w:jc w:val="center"/>
@@ -3953,8 +3657,6 @@
               </w:rPr>
               <w:t>27</w:t>
             </w:r>
-            <w:bookmarkStart w:id="1" w:name="_GoBack"/>
-            <w:bookmarkEnd w:id="1"/>
             <w:r>
               <w:rPr>
                 <w:color w:val="000000" w:themeColor="text1"/>
@@ -3971,22 +3673,6 @@
         </w:tc>
       </w:tr>
       <w:tr>
-        <w:tblPrEx>
-          <w:tblBorders>
-            <w:top w:val="single" w:color="auto" w:sz="4" w:space="0"/>
-            <w:left w:val="single" w:color="auto" w:sz="4" w:space="0"/>
-            <w:bottom w:val="single" w:color="auto" w:sz="4" w:space="0"/>
-            <w:right w:val="single" w:color="auto" w:sz="4" w:space="0"/>
-            <w:insideH w:val="single" w:color="auto" w:sz="4" w:space="0"/>
-            <w:insideV w:val="single" w:color="auto" w:sz="4" w:space="0"/>
-          </w:tblBorders>
-          <w:tblCellMar>
-            <w:top w:w="0" w:type="dxa"/>
-            <w:left w:w="108" w:type="dxa"/>
-            <w:bottom w:w="0" w:type="dxa"/>
-            <w:right w:w="108" w:type="dxa"/>
-          </w:tblCellMar>
-        </w:tblPrEx>
         <w:trPr>
           <w:trHeight w:val="390" w:hRule="atLeast"/>
           <w:jc w:val="center"/>
@@ -4093,22 +3779,6 @@
         </w:tc>
       </w:tr>
       <w:tr>
-        <w:tblPrEx>
-          <w:tblBorders>
-            <w:top w:val="single" w:color="auto" w:sz="4" w:space="0"/>
-            <w:left w:val="single" w:color="auto" w:sz="4" w:space="0"/>
-            <w:bottom w:val="single" w:color="auto" w:sz="4" w:space="0"/>
-            <w:right w:val="single" w:color="auto" w:sz="4" w:space="0"/>
-            <w:insideH w:val="single" w:color="auto" w:sz="4" w:space="0"/>
-            <w:insideV w:val="single" w:color="auto" w:sz="4" w:space="0"/>
-          </w:tblBorders>
-          <w:tblCellMar>
-            <w:top w:w="0" w:type="dxa"/>
-            <w:left w:w="108" w:type="dxa"/>
-            <w:bottom w:w="0" w:type="dxa"/>
-            <w:right w:w="108" w:type="dxa"/>
-          </w:tblCellMar>
-        </w:tblPrEx>
         <w:trPr>
           <w:trHeight w:val="390" w:hRule="atLeast"/>
           <w:jc w:val="center"/>
@@ -4207,22 +3877,6 @@
         </w:tc>
       </w:tr>
       <w:tr>
-        <w:tblPrEx>
-          <w:tblBorders>
-            <w:top w:val="single" w:color="auto" w:sz="4" w:space="0"/>
-            <w:left w:val="single" w:color="auto" w:sz="4" w:space="0"/>
-            <w:bottom w:val="single" w:color="auto" w:sz="4" w:space="0"/>
-            <w:right w:val="single" w:color="auto" w:sz="4" w:space="0"/>
-            <w:insideH w:val="single" w:color="auto" w:sz="4" w:space="0"/>
-            <w:insideV w:val="single" w:color="auto" w:sz="4" w:space="0"/>
-          </w:tblBorders>
-          <w:tblCellMar>
-            <w:top w:w="0" w:type="dxa"/>
-            <w:left w:w="108" w:type="dxa"/>
-            <w:bottom w:w="0" w:type="dxa"/>
-            <w:right w:w="108" w:type="dxa"/>
-          </w:tblCellMar>
-        </w:tblPrEx>
         <w:trPr>
           <w:trHeight w:val="390" w:hRule="atLeast"/>
           <w:jc w:val="center"/>
@@ -4321,22 +3975,6 @@
         </w:tc>
       </w:tr>
       <w:tr>
-        <w:tblPrEx>
-          <w:tblBorders>
-            <w:top w:val="single" w:color="auto" w:sz="4" w:space="0"/>
-            <w:left w:val="single" w:color="auto" w:sz="4" w:space="0"/>
-            <w:bottom w:val="single" w:color="auto" w:sz="4" w:space="0"/>
-            <w:right w:val="single" w:color="auto" w:sz="4" w:space="0"/>
-            <w:insideH w:val="single" w:color="auto" w:sz="4" w:space="0"/>
-            <w:insideV w:val="single" w:color="auto" w:sz="4" w:space="0"/>
-          </w:tblBorders>
-          <w:tblCellMar>
-            <w:top w:w="0" w:type="dxa"/>
-            <w:left w:w="108" w:type="dxa"/>
-            <w:bottom w:w="0" w:type="dxa"/>
-            <w:right w:w="108" w:type="dxa"/>
-          </w:tblCellMar>
-        </w:tblPrEx>
         <w:trPr>
           <w:trHeight w:val="390" w:hRule="atLeast"/>
           <w:jc w:val="center"/>
@@ -4435,22 +4073,6 @@
         </w:tc>
       </w:tr>
       <w:tr>
-        <w:tblPrEx>
-          <w:tblBorders>
-            <w:top w:val="single" w:color="auto" w:sz="4" w:space="0"/>
-            <w:left w:val="single" w:color="auto" w:sz="4" w:space="0"/>
-            <w:bottom w:val="single" w:color="auto" w:sz="4" w:space="0"/>
-            <w:right w:val="single" w:color="auto" w:sz="4" w:space="0"/>
-            <w:insideH w:val="single" w:color="auto" w:sz="4" w:space="0"/>
-            <w:insideV w:val="single" w:color="auto" w:sz="4" w:space="0"/>
-          </w:tblBorders>
-          <w:tblCellMar>
-            <w:top w:w="0" w:type="dxa"/>
-            <w:left w:w="108" w:type="dxa"/>
-            <w:bottom w:w="0" w:type="dxa"/>
-            <w:right w:w="108" w:type="dxa"/>
-          </w:tblCellMar>
-        </w:tblPrEx>
         <w:trPr>
           <w:trHeight w:val="390" w:hRule="atLeast"/>
           <w:jc w:val="center"/>
@@ -4545,22 +4167,6 @@
         </w:tc>
       </w:tr>
       <w:tr>
-        <w:tblPrEx>
-          <w:tblBorders>
-            <w:top w:val="single" w:color="auto" w:sz="4" w:space="0"/>
-            <w:left w:val="single" w:color="auto" w:sz="4" w:space="0"/>
-            <w:bottom w:val="single" w:color="auto" w:sz="4" w:space="0"/>
-            <w:right w:val="single" w:color="auto" w:sz="4" w:space="0"/>
-            <w:insideH w:val="single" w:color="auto" w:sz="4" w:space="0"/>
-            <w:insideV w:val="single" w:color="auto" w:sz="4" w:space="0"/>
-          </w:tblBorders>
-          <w:tblCellMar>
-            <w:top w:w="0" w:type="dxa"/>
-            <w:left w:w="108" w:type="dxa"/>
-            <w:bottom w:w="0" w:type="dxa"/>
-            <w:right w:w="108" w:type="dxa"/>
-          </w:tblCellMar>
-        </w:tblPrEx>
         <w:trPr>
           <w:trHeight w:val="390" w:hRule="atLeast"/>
           <w:jc w:val="center"/>
@@ -4655,22 +4261,6 @@
         </w:tc>
       </w:tr>
       <w:tr>
-        <w:tblPrEx>
-          <w:tblBorders>
-            <w:top w:val="single" w:color="auto" w:sz="4" w:space="0"/>
-            <w:left w:val="single" w:color="auto" w:sz="4" w:space="0"/>
-            <w:bottom w:val="single" w:color="auto" w:sz="4" w:space="0"/>
-            <w:right w:val="single" w:color="auto" w:sz="4" w:space="0"/>
-            <w:insideH w:val="single" w:color="auto" w:sz="4" w:space="0"/>
-            <w:insideV w:val="single" w:color="auto" w:sz="4" w:space="0"/>
-          </w:tblBorders>
-          <w:tblCellMar>
-            <w:top w:w="0" w:type="dxa"/>
-            <w:left w:w="108" w:type="dxa"/>
-            <w:bottom w:w="0" w:type="dxa"/>
-            <w:right w:w="108" w:type="dxa"/>
-          </w:tblCellMar>
-        </w:tblPrEx>
         <w:trPr>
           <w:trHeight w:val="390" w:hRule="atLeast"/>
           <w:jc w:val="center"/>
@@ -4765,22 +4355,6 @@
         </w:tc>
       </w:tr>
       <w:tr>
-        <w:tblPrEx>
-          <w:tblBorders>
-            <w:top w:val="single" w:color="auto" w:sz="4" w:space="0"/>
-            <w:left w:val="single" w:color="auto" w:sz="4" w:space="0"/>
-            <w:bottom w:val="single" w:color="auto" w:sz="4" w:space="0"/>
-            <w:right w:val="single" w:color="auto" w:sz="4" w:space="0"/>
-            <w:insideH w:val="single" w:color="auto" w:sz="4" w:space="0"/>
-            <w:insideV w:val="single" w:color="auto" w:sz="4" w:space="0"/>
-          </w:tblBorders>
-          <w:tblCellMar>
-            <w:top w:w="0" w:type="dxa"/>
-            <w:left w:w="108" w:type="dxa"/>
-            <w:bottom w:w="0" w:type="dxa"/>
-            <w:right w:w="108" w:type="dxa"/>
-          </w:tblCellMar>
-        </w:tblPrEx>
         <w:trPr>
           <w:trHeight w:val="390" w:hRule="atLeast"/>
           <w:jc w:val="center"/>
@@ -4875,22 +4449,6 @@
         </w:tc>
       </w:tr>
       <w:tr>
-        <w:tblPrEx>
-          <w:tblBorders>
-            <w:top w:val="single" w:color="auto" w:sz="4" w:space="0"/>
-            <w:left w:val="single" w:color="auto" w:sz="4" w:space="0"/>
-            <w:bottom w:val="single" w:color="auto" w:sz="4" w:space="0"/>
-            <w:right w:val="single" w:color="auto" w:sz="4" w:space="0"/>
-            <w:insideH w:val="single" w:color="auto" w:sz="4" w:space="0"/>
-            <w:insideV w:val="single" w:color="auto" w:sz="4" w:space="0"/>
-          </w:tblBorders>
-          <w:tblCellMar>
-            <w:top w:w="0" w:type="dxa"/>
-            <w:left w:w="108" w:type="dxa"/>
-            <w:bottom w:w="0" w:type="dxa"/>
-            <w:right w:w="108" w:type="dxa"/>
-          </w:tblCellMar>
-        </w:tblPrEx>
         <w:trPr>
           <w:trHeight w:val="390" w:hRule="atLeast"/>
           <w:jc w:val="center"/>
@@ -4985,22 +4543,6 @@
         </w:tc>
       </w:tr>
       <w:tr>
-        <w:tblPrEx>
-          <w:tblBorders>
-            <w:top w:val="single" w:color="auto" w:sz="4" w:space="0"/>
-            <w:left w:val="single" w:color="auto" w:sz="4" w:space="0"/>
-            <w:bottom w:val="single" w:color="auto" w:sz="4" w:space="0"/>
-            <w:right w:val="single" w:color="auto" w:sz="4" w:space="0"/>
-            <w:insideH w:val="single" w:color="auto" w:sz="4" w:space="0"/>
-            <w:insideV w:val="single" w:color="auto" w:sz="4" w:space="0"/>
-          </w:tblBorders>
-          <w:tblCellMar>
-            <w:top w:w="0" w:type="dxa"/>
-            <w:left w:w="108" w:type="dxa"/>
-            <w:bottom w:w="0" w:type="dxa"/>
-            <w:right w:w="108" w:type="dxa"/>
-          </w:tblCellMar>
-        </w:tblPrEx>
         <w:trPr>
           <w:trHeight w:val="390" w:hRule="atLeast"/>
           <w:jc w:val="center"/>
@@ -5124,22 +4666,6 @@
         </w:tc>
       </w:tr>
       <w:tr>
-        <w:tblPrEx>
-          <w:tblBorders>
-            <w:top w:val="single" w:color="auto" w:sz="4" w:space="0"/>
-            <w:left w:val="single" w:color="auto" w:sz="4" w:space="0"/>
-            <w:bottom w:val="single" w:color="auto" w:sz="4" w:space="0"/>
-            <w:right w:val="single" w:color="auto" w:sz="4" w:space="0"/>
-            <w:insideH w:val="single" w:color="auto" w:sz="4" w:space="0"/>
-            <w:insideV w:val="single" w:color="auto" w:sz="4" w:space="0"/>
-          </w:tblBorders>
-          <w:tblCellMar>
-            <w:top w:w="0" w:type="dxa"/>
-            <w:left w:w="108" w:type="dxa"/>
-            <w:bottom w:w="0" w:type="dxa"/>
-            <w:right w:w="108" w:type="dxa"/>
-          </w:tblCellMar>
-        </w:tblPrEx>
         <w:trPr>
           <w:trHeight w:val="390" w:hRule="atLeast"/>
           <w:jc w:val="center"/>
@@ -5349,22 +4875,6 @@
         </w:tc>
       </w:tr>
       <w:tr>
-        <w:tblPrEx>
-          <w:tblBorders>
-            <w:top w:val="single" w:color="auto" w:sz="4" w:space="0"/>
-            <w:left w:val="single" w:color="auto" w:sz="4" w:space="0"/>
-            <w:bottom w:val="single" w:color="auto" w:sz="4" w:space="0"/>
-            <w:right w:val="single" w:color="auto" w:sz="4" w:space="0"/>
-            <w:insideH w:val="single" w:color="auto" w:sz="4" w:space="0"/>
-            <w:insideV w:val="single" w:color="auto" w:sz="4" w:space="0"/>
-          </w:tblBorders>
-          <w:tblCellMar>
-            <w:top w:w="0" w:type="dxa"/>
-            <w:left w:w="108" w:type="dxa"/>
-            <w:bottom w:w="0" w:type="dxa"/>
-            <w:right w:w="108" w:type="dxa"/>
-          </w:tblCellMar>
-        </w:tblPrEx>
         <w:trPr>
           <w:trHeight w:val="390" w:hRule="atLeast"/>
           <w:jc w:val="center"/>
@@ -5464,22 +4974,6 @@
         </w:tc>
       </w:tr>
       <w:tr>
-        <w:tblPrEx>
-          <w:tblBorders>
-            <w:top w:val="single" w:color="auto" w:sz="4" w:space="0"/>
-            <w:left w:val="single" w:color="auto" w:sz="4" w:space="0"/>
-            <w:bottom w:val="single" w:color="auto" w:sz="4" w:space="0"/>
-            <w:right w:val="single" w:color="auto" w:sz="4" w:space="0"/>
-            <w:insideH w:val="single" w:color="auto" w:sz="4" w:space="0"/>
-            <w:insideV w:val="single" w:color="auto" w:sz="4" w:space="0"/>
-          </w:tblBorders>
-          <w:tblCellMar>
-            <w:top w:w="0" w:type="dxa"/>
-            <w:left w:w="108" w:type="dxa"/>
-            <w:bottom w:w="0" w:type="dxa"/>
-            <w:right w:w="108" w:type="dxa"/>
-          </w:tblCellMar>
-        </w:tblPrEx>
         <w:trPr>
           <w:trHeight w:val="390" w:hRule="atLeast"/>
           <w:jc w:val="center"/>
@@ -5579,22 +5073,6 @@
         </w:tc>
       </w:tr>
       <w:tr>
-        <w:tblPrEx>
-          <w:tblBorders>
-            <w:top w:val="single" w:color="auto" w:sz="4" w:space="0"/>
-            <w:left w:val="single" w:color="auto" w:sz="4" w:space="0"/>
-            <w:bottom w:val="single" w:color="auto" w:sz="4" w:space="0"/>
-            <w:right w:val="single" w:color="auto" w:sz="4" w:space="0"/>
-            <w:insideH w:val="single" w:color="auto" w:sz="4" w:space="0"/>
-            <w:insideV w:val="single" w:color="auto" w:sz="4" w:space="0"/>
-          </w:tblBorders>
-          <w:tblCellMar>
-            <w:top w:w="0" w:type="dxa"/>
-            <w:left w:w="108" w:type="dxa"/>
-            <w:bottom w:w="0" w:type="dxa"/>
-            <w:right w:w="108" w:type="dxa"/>
-          </w:tblCellMar>
-        </w:tblPrEx>
         <w:trPr>
           <w:trHeight w:val="390" w:hRule="atLeast"/>
           <w:jc w:val="center"/>
@@ -5750,22 +5228,6 @@
         <w:gridCol w:w="4700"/>
       </w:tblGrid>
       <w:tr>
-        <w:tblPrEx>
-          <w:tblBorders>
-            <w:top w:val="single" w:color="auto" w:sz="4" w:space="0"/>
-            <w:left w:val="single" w:color="auto" w:sz="4" w:space="0"/>
-            <w:bottom w:val="single" w:color="auto" w:sz="4" w:space="0"/>
-            <w:right w:val="single" w:color="auto" w:sz="4" w:space="0"/>
-            <w:insideH w:val="single" w:color="auto" w:sz="4" w:space="0"/>
-            <w:insideV w:val="single" w:color="auto" w:sz="4" w:space="0"/>
-          </w:tblBorders>
-          <w:tblCellMar>
-            <w:top w:w="0" w:type="dxa"/>
-            <w:left w:w="108" w:type="dxa"/>
-            <w:bottom w:w="0" w:type="dxa"/>
-            <w:right w:w="108" w:type="dxa"/>
-          </w:tblCellMar>
-        </w:tblPrEx>
         <w:trPr>
           <w:jc w:val="center"/>
         </w:trPr>
@@ -5857,22 +5319,6 @@
         </w:tc>
       </w:tr>
       <w:tr>
-        <w:tblPrEx>
-          <w:tblBorders>
-            <w:top w:val="single" w:color="auto" w:sz="4" w:space="0"/>
-            <w:left w:val="single" w:color="auto" w:sz="4" w:space="0"/>
-            <w:bottom w:val="single" w:color="auto" w:sz="4" w:space="0"/>
-            <w:right w:val="single" w:color="auto" w:sz="4" w:space="0"/>
-            <w:insideH w:val="single" w:color="auto" w:sz="4" w:space="0"/>
-            <w:insideV w:val="single" w:color="auto" w:sz="4" w:space="0"/>
-          </w:tblBorders>
-          <w:tblCellMar>
-            <w:top w:w="0" w:type="dxa"/>
-            <w:left w:w="108" w:type="dxa"/>
-            <w:bottom w:w="0" w:type="dxa"/>
-            <w:right w:w="108" w:type="dxa"/>
-          </w:tblCellMar>
-        </w:tblPrEx>
         <w:trPr>
           <w:trHeight w:val="248" w:hRule="atLeast"/>
           <w:jc w:val="center"/>
@@ -5914,22 +5360,6 @@
         </w:tc>
       </w:tr>
       <w:tr>
-        <w:tblPrEx>
-          <w:tblBorders>
-            <w:top w:val="single" w:color="auto" w:sz="4" w:space="0"/>
-            <w:left w:val="single" w:color="auto" w:sz="4" w:space="0"/>
-            <w:bottom w:val="single" w:color="auto" w:sz="4" w:space="0"/>
-            <w:right w:val="single" w:color="auto" w:sz="4" w:space="0"/>
-            <w:insideH w:val="single" w:color="auto" w:sz="4" w:space="0"/>
-            <w:insideV w:val="single" w:color="auto" w:sz="4" w:space="0"/>
-          </w:tblBorders>
-          <w:tblCellMar>
-            <w:top w:w="0" w:type="dxa"/>
-            <w:left w:w="108" w:type="dxa"/>
-            <w:bottom w:w="0" w:type="dxa"/>
-            <w:right w:w="108" w:type="dxa"/>
-          </w:tblCellMar>
-        </w:tblPrEx>
         <w:trPr>
           <w:jc w:val="center"/>
         </w:trPr>
@@ -6007,22 +5437,6 @@
         </w:tc>
       </w:tr>
       <w:tr>
-        <w:tblPrEx>
-          <w:tblBorders>
-            <w:top w:val="single" w:color="auto" w:sz="4" w:space="0"/>
-            <w:left w:val="single" w:color="auto" w:sz="4" w:space="0"/>
-            <w:bottom w:val="single" w:color="auto" w:sz="4" w:space="0"/>
-            <w:right w:val="single" w:color="auto" w:sz="4" w:space="0"/>
-            <w:insideH w:val="single" w:color="auto" w:sz="4" w:space="0"/>
-            <w:insideV w:val="single" w:color="auto" w:sz="4" w:space="0"/>
-          </w:tblBorders>
-          <w:tblCellMar>
-            <w:top w:w="0" w:type="dxa"/>
-            <w:left w:w="108" w:type="dxa"/>
-            <w:bottom w:w="0" w:type="dxa"/>
-            <w:right w:w="108" w:type="dxa"/>
-          </w:tblCellMar>
-        </w:tblPrEx>
         <w:trPr>
           <w:trHeight w:val="299" w:hRule="atLeast"/>
           <w:jc w:val="center"/>
@@ -6449,7 +5863,47 @@
             </w14:solidFill>
           </w14:textFill>
         </w:rPr>
-        <w:t>膨胀机                                                      1台</w:t>
+        <w:t xml:space="preserve">膨胀机                                                   </w:t>
+      </w:r>
+      <w:r>
+        <w:rPr>
+          <w:rFonts w:hint="default"/>
+          <w:color w:val="000000" w:themeColor="text1"/>
+          <w:sz w:val="24"/>
+          <w:lang w:val="en-US"/>
+          <w14:textFill>
+            <w14:solidFill>
+              <w14:schemeClr w14:val="tx1"/>
+            </w14:solidFill>
+          </w14:textFill>
+        </w:rPr>
+        <w:t>auto_aspen_</w:t>
+      </w:r>
+      <w:r>
+        <w:rPr>
+          <w:rFonts w:hint="eastAsia"/>
+          <w:color w:val="000000" w:themeColor="text1"/>
+          <w:sz w:val="24"/>
+          <w:lang w:val="en-US" w:eastAsia="zh-CN"/>
+          <w14:textFill>
+            <w14:solidFill>
+              <w14:schemeClr w14:val="tx1"/>
+            </w14:solidFill>
+          </w14:textFill>
+        </w:rPr>
+        <w:t>8</w:t>
+      </w:r>
+      <w:r>
+        <w:rPr>
+          <w:color w:val="000000" w:themeColor="text1"/>
+          <w:sz w:val="24"/>
+          <w14:textFill>
+            <w14:solidFill>
+              <w14:schemeClr w14:val="tx1"/>
+            </w14:solidFill>
+          </w14:textFill>
+        </w:rPr>
+        <w:t xml:space="preserve">   台</w:t>
       </w:r>
     </w:p>
     <w:p>
@@ -7138,22 +6592,6 @@
         <w:gridCol w:w="1373"/>
       </w:tblGrid>
       <w:tr>
-        <w:tblPrEx>
-          <w:tblBorders>
-            <w:top w:val="single" w:color="auto" w:sz="4" w:space="0"/>
-            <w:left w:val="single" w:color="auto" w:sz="4" w:space="0"/>
-            <w:bottom w:val="single" w:color="auto" w:sz="4" w:space="0"/>
-            <w:right w:val="single" w:color="auto" w:sz="4" w:space="0"/>
-            <w:insideH w:val="single" w:color="auto" w:sz="4" w:space="0"/>
-            <w:insideV w:val="single" w:color="auto" w:sz="4" w:space="0"/>
-          </w:tblBorders>
-          <w:tblCellMar>
-            <w:top w:w="0" w:type="dxa"/>
-            <w:left w:w="108" w:type="dxa"/>
-            <w:bottom w:w="0" w:type="dxa"/>
-            <w:right w:w="108" w:type="dxa"/>
-          </w:tblCellMar>
-        </w:tblPrEx>
         <w:trPr>
           <w:trHeight w:val="114" w:hRule="atLeast"/>
           <w:jc w:val="center"/>
@@ -7308,22 +6746,6 @@
         </w:tc>
       </w:tr>
       <w:tr>
-        <w:tblPrEx>
-          <w:tblBorders>
-            <w:top w:val="single" w:color="auto" w:sz="4" w:space="0"/>
-            <w:left w:val="single" w:color="auto" w:sz="4" w:space="0"/>
-            <w:bottom w:val="single" w:color="auto" w:sz="4" w:space="0"/>
-            <w:right w:val="single" w:color="auto" w:sz="4" w:space="0"/>
-            <w:insideH w:val="single" w:color="auto" w:sz="4" w:space="0"/>
-            <w:insideV w:val="single" w:color="auto" w:sz="4" w:space="0"/>
-          </w:tblBorders>
-          <w:tblCellMar>
-            <w:top w:w="0" w:type="dxa"/>
-            <w:left w:w="108" w:type="dxa"/>
-            <w:bottom w:w="0" w:type="dxa"/>
-            <w:right w:w="108" w:type="dxa"/>
-          </w:tblCellMar>
-        </w:tblPrEx>
         <w:trPr>
           <w:trHeight w:val="436" w:hRule="atLeast"/>
           <w:jc w:val="center"/>
@@ -7525,22 +6947,6 @@
         </w:tc>
       </w:tr>
       <w:tr>
-        <w:tblPrEx>
-          <w:tblBorders>
-            <w:top w:val="single" w:color="auto" w:sz="4" w:space="0"/>
-            <w:left w:val="single" w:color="auto" w:sz="4" w:space="0"/>
-            <w:bottom w:val="single" w:color="auto" w:sz="4" w:space="0"/>
-            <w:right w:val="single" w:color="auto" w:sz="4" w:space="0"/>
-            <w:insideH w:val="single" w:color="auto" w:sz="4" w:space="0"/>
-            <w:insideV w:val="single" w:color="auto" w:sz="4" w:space="0"/>
-          </w:tblBorders>
-          <w:tblCellMar>
-            <w:top w:w="0" w:type="dxa"/>
-            <w:left w:w="108" w:type="dxa"/>
-            <w:bottom w:w="0" w:type="dxa"/>
-            <w:right w:w="108" w:type="dxa"/>
-          </w:tblCellMar>
-        </w:tblPrEx>
         <w:trPr>
           <w:trHeight w:val="482" w:hRule="atLeast"/>
           <w:jc w:val="center"/>
@@ -7717,22 +7123,6 @@
         </w:tc>
       </w:tr>
       <w:tr>
-        <w:tblPrEx>
-          <w:tblBorders>
-            <w:top w:val="single" w:color="auto" w:sz="4" w:space="0"/>
-            <w:left w:val="single" w:color="auto" w:sz="4" w:space="0"/>
-            <w:bottom w:val="single" w:color="auto" w:sz="4" w:space="0"/>
-            <w:right w:val="single" w:color="auto" w:sz="4" w:space="0"/>
-            <w:insideH w:val="single" w:color="auto" w:sz="4" w:space="0"/>
-            <w:insideV w:val="single" w:color="auto" w:sz="4" w:space="0"/>
-          </w:tblBorders>
-          <w:tblCellMar>
-            <w:top w:w="0" w:type="dxa"/>
-            <w:left w:w="108" w:type="dxa"/>
-            <w:bottom w:w="0" w:type="dxa"/>
-            <w:right w:w="108" w:type="dxa"/>
-          </w:tblCellMar>
-        </w:tblPrEx>
         <w:trPr>
           <w:trHeight w:val="482" w:hRule="atLeast"/>
           <w:jc w:val="center"/>
@@ -7909,22 +7299,6 @@
         </w:tc>
       </w:tr>
       <w:tr>
-        <w:tblPrEx>
-          <w:tblBorders>
-            <w:top w:val="single" w:color="auto" w:sz="4" w:space="0"/>
-            <w:left w:val="single" w:color="auto" w:sz="4" w:space="0"/>
-            <w:bottom w:val="single" w:color="auto" w:sz="4" w:space="0"/>
-            <w:right w:val="single" w:color="auto" w:sz="4" w:space="0"/>
-            <w:insideH w:val="single" w:color="auto" w:sz="4" w:space="0"/>
-            <w:insideV w:val="single" w:color="auto" w:sz="4" w:space="0"/>
-          </w:tblBorders>
-          <w:tblCellMar>
-            <w:top w:w="0" w:type="dxa"/>
-            <w:left w:w="108" w:type="dxa"/>
-            <w:bottom w:w="0" w:type="dxa"/>
-            <w:right w:w="108" w:type="dxa"/>
-          </w:tblCellMar>
-        </w:tblPrEx>
         <w:trPr>
           <w:trHeight w:val="50" w:hRule="atLeast"/>
           <w:jc w:val="center"/>
@@ -8113,22 +7487,6 @@
         </w:tc>
       </w:tr>
       <w:tr>
-        <w:tblPrEx>
-          <w:tblBorders>
-            <w:top w:val="single" w:color="auto" w:sz="4" w:space="0"/>
-            <w:left w:val="single" w:color="auto" w:sz="4" w:space="0"/>
-            <w:bottom w:val="single" w:color="auto" w:sz="4" w:space="0"/>
-            <w:right w:val="single" w:color="auto" w:sz="4" w:space="0"/>
-            <w:insideH w:val="single" w:color="auto" w:sz="4" w:space="0"/>
-            <w:insideV w:val="single" w:color="auto" w:sz="4" w:space="0"/>
-          </w:tblBorders>
-          <w:tblCellMar>
-            <w:top w:w="0" w:type="dxa"/>
-            <w:left w:w="108" w:type="dxa"/>
-            <w:bottom w:w="0" w:type="dxa"/>
-            <w:right w:w="108" w:type="dxa"/>
-          </w:tblCellMar>
-        </w:tblPrEx>
         <w:trPr>
           <w:trHeight w:val="104" w:hRule="atLeast"/>
           <w:jc w:val="center"/>
@@ -8317,22 +7675,6 @@
         </w:tc>
       </w:tr>
       <w:tr>
-        <w:tblPrEx>
-          <w:tblBorders>
-            <w:top w:val="single" w:color="auto" w:sz="4" w:space="0"/>
-            <w:left w:val="single" w:color="auto" w:sz="4" w:space="0"/>
-            <w:bottom w:val="single" w:color="auto" w:sz="4" w:space="0"/>
-            <w:right w:val="single" w:color="auto" w:sz="4" w:space="0"/>
-            <w:insideH w:val="single" w:color="auto" w:sz="4" w:space="0"/>
-            <w:insideV w:val="single" w:color="auto" w:sz="4" w:space="0"/>
-          </w:tblBorders>
-          <w:tblCellMar>
-            <w:top w:w="0" w:type="dxa"/>
-            <w:left w:w="108" w:type="dxa"/>
-            <w:bottom w:w="0" w:type="dxa"/>
-            <w:right w:w="108" w:type="dxa"/>
-          </w:tblCellMar>
-        </w:tblPrEx>
         <w:trPr>
           <w:trHeight w:val="482" w:hRule="atLeast"/>
           <w:jc w:val="center"/>
@@ -8570,22 +7912,6 @@
         </w:tc>
       </w:tr>
       <w:tr>
-        <w:tblPrEx>
-          <w:tblBorders>
-            <w:top w:val="single" w:color="auto" w:sz="4" w:space="0"/>
-            <w:left w:val="single" w:color="auto" w:sz="4" w:space="0"/>
-            <w:bottom w:val="single" w:color="auto" w:sz="4" w:space="0"/>
-            <w:right w:val="single" w:color="auto" w:sz="4" w:space="0"/>
-            <w:insideH w:val="single" w:color="auto" w:sz="4" w:space="0"/>
-            <w:insideV w:val="single" w:color="auto" w:sz="4" w:space="0"/>
-          </w:tblBorders>
-          <w:tblCellMar>
-            <w:top w:w="0" w:type="dxa"/>
-            <w:left w:w="108" w:type="dxa"/>
-            <w:bottom w:w="0" w:type="dxa"/>
-            <w:right w:w="108" w:type="dxa"/>
-          </w:tblCellMar>
-        </w:tblPrEx>
         <w:trPr>
           <w:trHeight w:val="86" w:hRule="atLeast"/>
           <w:jc w:val="center"/>
@@ -8789,22 +8115,6 @@
         </w:tc>
       </w:tr>
       <w:tr>
-        <w:tblPrEx>
-          <w:tblBorders>
-            <w:top w:val="single" w:color="auto" w:sz="4" w:space="0"/>
-            <w:left w:val="single" w:color="auto" w:sz="4" w:space="0"/>
-            <w:bottom w:val="single" w:color="auto" w:sz="4" w:space="0"/>
-            <w:right w:val="single" w:color="auto" w:sz="4" w:space="0"/>
-            <w:insideH w:val="single" w:color="auto" w:sz="4" w:space="0"/>
-            <w:insideV w:val="single" w:color="auto" w:sz="4" w:space="0"/>
-          </w:tblBorders>
-          <w:tblCellMar>
-            <w:top w:w="0" w:type="dxa"/>
-            <w:left w:w="108" w:type="dxa"/>
-            <w:bottom w:w="0" w:type="dxa"/>
-            <w:right w:w="108" w:type="dxa"/>
-          </w:tblCellMar>
-        </w:tblPrEx>
         <w:trPr>
           <w:trHeight w:val="50" w:hRule="atLeast"/>
           <w:jc w:val="center"/>
@@ -9018,22 +8328,6 @@
         </w:tc>
       </w:tr>
       <w:tr>
-        <w:tblPrEx>
-          <w:tblBorders>
-            <w:top w:val="single" w:color="auto" w:sz="4" w:space="0"/>
-            <w:left w:val="single" w:color="auto" w:sz="4" w:space="0"/>
-            <w:bottom w:val="single" w:color="auto" w:sz="4" w:space="0"/>
-            <w:right w:val="single" w:color="auto" w:sz="4" w:space="0"/>
-            <w:insideH w:val="single" w:color="auto" w:sz="4" w:space="0"/>
-            <w:insideV w:val="single" w:color="auto" w:sz="4" w:space="0"/>
-          </w:tblBorders>
-          <w:tblCellMar>
-            <w:top w:w="0" w:type="dxa"/>
-            <w:left w:w="108" w:type="dxa"/>
-            <w:bottom w:w="0" w:type="dxa"/>
-            <w:right w:w="108" w:type="dxa"/>
-          </w:tblCellMar>
-        </w:tblPrEx>
         <w:trPr>
           <w:trHeight w:val="50" w:hRule="atLeast"/>
           <w:jc w:val="center"/>
@@ -9419,22 +8713,6 @@
         <w:gridCol w:w="2702"/>
       </w:tblGrid>
       <w:tr>
-        <w:tblPrEx>
-          <w:tblBorders>
-            <w:top w:val="single" w:color="auto" w:sz="8" w:space="0"/>
-            <w:left w:val="single" w:color="auto" w:sz="8" w:space="0"/>
-            <w:bottom w:val="single" w:color="auto" w:sz="8" w:space="0"/>
-            <w:right w:val="single" w:color="auto" w:sz="8" w:space="0"/>
-            <w:insideH w:val="single" w:color="auto" w:sz="8" w:space="0"/>
-            <w:insideV w:val="single" w:color="auto" w:sz="8" w:space="0"/>
-          </w:tblBorders>
-          <w:tblCellMar>
-            <w:top w:w="0" w:type="dxa"/>
-            <w:left w:w="108" w:type="dxa"/>
-            <w:bottom w:w="0" w:type="dxa"/>
-            <w:right w:w="108" w:type="dxa"/>
-          </w:tblCellMar>
-        </w:tblPrEx>
         <w:trPr>
           <w:trHeight w:val="360" w:hRule="atLeast"/>
           <w:jc w:val="center"/>
@@ -9509,22 +8787,6 @@
         </w:tc>
       </w:tr>
       <w:tr>
-        <w:tblPrEx>
-          <w:tblBorders>
-            <w:top w:val="single" w:color="auto" w:sz="8" w:space="0"/>
-            <w:left w:val="single" w:color="auto" w:sz="8" w:space="0"/>
-            <w:bottom w:val="single" w:color="auto" w:sz="8" w:space="0"/>
-            <w:right w:val="single" w:color="auto" w:sz="8" w:space="0"/>
-            <w:insideH w:val="single" w:color="auto" w:sz="8" w:space="0"/>
-            <w:insideV w:val="single" w:color="auto" w:sz="8" w:space="0"/>
-          </w:tblBorders>
-          <w:tblCellMar>
-            <w:top w:w="0" w:type="dxa"/>
-            <w:left w:w="108" w:type="dxa"/>
-            <w:bottom w:w="0" w:type="dxa"/>
-            <w:right w:w="108" w:type="dxa"/>
-          </w:tblCellMar>
-        </w:tblPrEx>
         <w:trPr>
           <w:trHeight w:val="360" w:hRule="atLeast"/>
           <w:jc w:val="center"/>
@@ -9685,22 +8947,6 @@
         </w:tc>
       </w:tr>
       <w:tr>
-        <w:tblPrEx>
-          <w:tblBorders>
-            <w:top w:val="single" w:color="auto" w:sz="8" w:space="0"/>
-            <w:left w:val="single" w:color="auto" w:sz="8" w:space="0"/>
-            <w:bottom w:val="single" w:color="auto" w:sz="8" w:space="0"/>
-            <w:right w:val="single" w:color="auto" w:sz="8" w:space="0"/>
-            <w:insideH w:val="single" w:color="auto" w:sz="8" w:space="0"/>
-            <w:insideV w:val="single" w:color="auto" w:sz="8" w:space="0"/>
-          </w:tblBorders>
-          <w:tblCellMar>
-            <w:top w:w="0" w:type="dxa"/>
-            <w:left w:w="108" w:type="dxa"/>
-            <w:bottom w:w="0" w:type="dxa"/>
-            <w:right w:w="108" w:type="dxa"/>
-          </w:tblCellMar>
-        </w:tblPrEx>
         <w:trPr>
           <w:trHeight w:val="35" w:hRule="atLeast"/>
           <w:jc w:val="center"/>
@@ -9876,22 +9122,6 @@
         </w:tc>
       </w:tr>
       <w:tr>
-        <w:tblPrEx>
-          <w:tblBorders>
-            <w:top w:val="single" w:color="auto" w:sz="8" w:space="0"/>
-            <w:left w:val="single" w:color="auto" w:sz="8" w:space="0"/>
-            <w:bottom w:val="single" w:color="auto" w:sz="8" w:space="0"/>
-            <w:right w:val="single" w:color="auto" w:sz="8" w:space="0"/>
-            <w:insideH w:val="single" w:color="auto" w:sz="8" w:space="0"/>
-            <w:insideV w:val="single" w:color="auto" w:sz="8" w:space="0"/>
-          </w:tblBorders>
-          <w:tblCellMar>
-            <w:top w:w="0" w:type="dxa"/>
-            <w:left w:w="108" w:type="dxa"/>
-            <w:bottom w:w="0" w:type="dxa"/>
-            <w:right w:w="108" w:type="dxa"/>
-          </w:tblCellMar>
-        </w:tblPrEx>
         <w:trPr>
           <w:trHeight w:val="360" w:hRule="atLeast"/>
           <w:jc w:val="center"/>
@@ -10092,22 +9322,6 @@
         </w:tc>
       </w:tr>
       <w:tr>
-        <w:tblPrEx>
-          <w:tblBorders>
-            <w:top w:val="single" w:color="auto" w:sz="8" w:space="0"/>
-            <w:left w:val="single" w:color="auto" w:sz="8" w:space="0"/>
-            <w:bottom w:val="single" w:color="auto" w:sz="8" w:space="0"/>
-            <w:right w:val="single" w:color="auto" w:sz="8" w:space="0"/>
-            <w:insideH w:val="single" w:color="auto" w:sz="8" w:space="0"/>
-            <w:insideV w:val="single" w:color="auto" w:sz="8" w:space="0"/>
-          </w:tblBorders>
-          <w:tblCellMar>
-            <w:top w:w="0" w:type="dxa"/>
-            <w:left w:w="108" w:type="dxa"/>
-            <w:bottom w:w="0" w:type="dxa"/>
-            <w:right w:w="108" w:type="dxa"/>
-          </w:tblCellMar>
-        </w:tblPrEx>
         <w:trPr>
           <w:trHeight w:val="360" w:hRule="atLeast"/>
           <w:jc w:val="center"/>
@@ -10283,22 +9497,6 @@
         </w:tc>
       </w:tr>
       <w:tr>
-        <w:tblPrEx>
-          <w:tblBorders>
-            <w:top w:val="single" w:color="auto" w:sz="8" w:space="0"/>
-            <w:left w:val="single" w:color="auto" w:sz="8" w:space="0"/>
-            <w:bottom w:val="single" w:color="auto" w:sz="8" w:space="0"/>
-            <w:right w:val="single" w:color="auto" w:sz="8" w:space="0"/>
-            <w:insideH w:val="single" w:color="auto" w:sz="8" w:space="0"/>
-            <w:insideV w:val="single" w:color="auto" w:sz="8" w:space="0"/>
-          </w:tblBorders>
-          <w:tblCellMar>
-            <w:top w:w="0" w:type="dxa"/>
-            <w:left w:w="108" w:type="dxa"/>
-            <w:bottom w:w="0" w:type="dxa"/>
-            <w:right w:w="108" w:type="dxa"/>
-          </w:tblCellMar>
-        </w:tblPrEx>
         <w:trPr>
           <w:trHeight w:val="360" w:hRule="atLeast"/>
           <w:jc w:val="center"/>
@@ -10474,22 +9672,6 @@
         </w:tc>
       </w:tr>
       <w:tr>
-        <w:tblPrEx>
-          <w:tblBorders>
-            <w:top w:val="single" w:color="auto" w:sz="8" w:space="0"/>
-            <w:left w:val="single" w:color="auto" w:sz="8" w:space="0"/>
-            <w:bottom w:val="single" w:color="auto" w:sz="8" w:space="0"/>
-            <w:right w:val="single" w:color="auto" w:sz="8" w:space="0"/>
-            <w:insideH w:val="single" w:color="auto" w:sz="8" w:space="0"/>
-            <w:insideV w:val="single" w:color="auto" w:sz="8" w:space="0"/>
-          </w:tblBorders>
-          <w:tblCellMar>
-            <w:top w:w="0" w:type="dxa"/>
-            <w:left w:w="108" w:type="dxa"/>
-            <w:bottom w:w="0" w:type="dxa"/>
-            <w:right w:w="108" w:type="dxa"/>
-          </w:tblCellMar>
-        </w:tblPrEx>
         <w:trPr>
           <w:trHeight w:val="360" w:hRule="atLeast"/>
           <w:jc w:val="center"/>
@@ -11011,14 +10193,6 @@
         <w:gridCol w:w="1272"/>
       </w:tblGrid>
       <w:tr>
-        <w:tblPrEx>
-          <w:tblCellMar>
-            <w:top w:w="0" w:type="dxa"/>
-            <w:left w:w="108" w:type="dxa"/>
-            <w:bottom w:w="0" w:type="dxa"/>
-            <w:right w:w="108" w:type="dxa"/>
-          </w:tblCellMar>
-        </w:tblPrEx>
         <w:trPr>
           <w:trHeight w:val="640" w:hRule="atLeast"/>
         </w:trPr>
@@ -11300,14 +10474,6 @@
         </w:tc>
       </w:tr>
       <w:tr>
-        <w:tblPrEx>
-          <w:tblCellMar>
-            <w:top w:w="0" w:type="dxa"/>
-            <w:left w:w="108" w:type="dxa"/>
-            <w:bottom w:w="0" w:type="dxa"/>
-            <w:right w:w="108" w:type="dxa"/>
-          </w:tblCellMar>
-        </w:tblPrEx>
         <w:trPr>
           <w:trHeight w:val="551" w:hRule="atLeast"/>
         </w:trPr>
@@ -11576,14 +10742,6 @@
         </w:tc>
       </w:tr>
       <w:tr>
-        <w:tblPrEx>
-          <w:tblCellMar>
-            <w:top w:w="0" w:type="dxa"/>
-            <w:left w:w="108" w:type="dxa"/>
-            <w:bottom w:w="0" w:type="dxa"/>
-            <w:right w:w="108" w:type="dxa"/>
-          </w:tblCellMar>
-        </w:tblPrEx>
         <w:trPr>
           <w:trHeight w:val="572" w:hRule="atLeast"/>
         </w:trPr>
@@ -11852,14 +11010,6 @@
         </w:tc>
       </w:tr>
       <w:tr>
-        <w:tblPrEx>
-          <w:tblCellMar>
-            <w:top w:w="0" w:type="dxa"/>
-            <w:left w:w="108" w:type="dxa"/>
-            <w:bottom w:w="0" w:type="dxa"/>
-            <w:right w:w="108" w:type="dxa"/>
-          </w:tblCellMar>
-        </w:tblPrEx>
         <w:trPr>
           <w:trHeight w:val="552" w:hRule="atLeast"/>
         </w:trPr>
@@ -12128,14 +11278,6 @@
         </w:tc>
       </w:tr>
       <w:tr>
-        <w:tblPrEx>
-          <w:tblCellMar>
-            <w:top w:w="0" w:type="dxa"/>
-            <w:left w:w="108" w:type="dxa"/>
-            <w:bottom w:w="0" w:type="dxa"/>
-            <w:right w:w="108" w:type="dxa"/>
-          </w:tblCellMar>
-        </w:tblPrEx>
         <w:trPr>
           <w:trHeight w:val="560" w:hRule="atLeast"/>
         </w:trPr>
@@ -12404,14 +11546,6 @@
         </w:tc>
       </w:tr>
       <w:tr>
-        <w:tblPrEx>
-          <w:tblCellMar>
-            <w:top w:w="0" w:type="dxa"/>
-            <w:left w:w="108" w:type="dxa"/>
-            <w:bottom w:w="0" w:type="dxa"/>
-            <w:right w:w="108" w:type="dxa"/>
-          </w:tblCellMar>
-        </w:tblPrEx>
         <w:trPr>
           <w:trHeight w:val="554" w:hRule="atLeast"/>
         </w:trPr>
@@ -12680,14 +11814,6 @@
         </w:tc>
       </w:tr>
       <w:tr>
-        <w:tblPrEx>
-          <w:tblCellMar>
-            <w:top w:w="0" w:type="dxa"/>
-            <w:left w:w="108" w:type="dxa"/>
-            <w:bottom w:w="0" w:type="dxa"/>
-            <w:right w:w="108" w:type="dxa"/>
-          </w:tblCellMar>
-        </w:tblPrEx>
         <w:trPr>
           <w:trHeight w:val="548" w:hRule="atLeast"/>
         </w:trPr>
@@ -12957,14 +12083,6 @@
         </w:tc>
       </w:tr>
       <w:tr>
-        <w:tblPrEx>
-          <w:tblCellMar>
-            <w:top w:w="0" w:type="dxa"/>
-            <w:left w:w="108" w:type="dxa"/>
-            <w:bottom w:w="0" w:type="dxa"/>
-            <w:right w:w="108" w:type="dxa"/>
-          </w:tblCellMar>
-        </w:tblPrEx>
         <w:trPr>
           <w:trHeight w:val="570" w:hRule="atLeast"/>
         </w:trPr>
@@ -13233,14 +12351,6 @@
         </w:tc>
       </w:tr>
       <w:tr>
-        <w:tblPrEx>
-          <w:tblCellMar>
-            <w:top w:w="0" w:type="dxa"/>
-            <w:left w:w="108" w:type="dxa"/>
-            <w:bottom w:w="0" w:type="dxa"/>
-            <w:right w:w="108" w:type="dxa"/>
-          </w:tblCellMar>
-        </w:tblPrEx>
         <w:trPr>
           <w:trHeight w:val="550" w:hRule="atLeast"/>
         </w:trPr>
@@ -13509,14 +12619,6 @@
         </w:tc>
       </w:tr>
       <w:tr>
-        <w:tblPrEx>
-          <w:tblCellMar>
-            <w:top w:w="0" w:type="dxa"/>
-            <w:left w:w="108" w:type="dxa"/>
-            <w:bottom w:w="0" w:type="dxa"/>
-            <w:right w:w="108" w:type="dxa"/>
-          </w:tblCellMar>
-        </w:tblPrEx>
         <w:trPr>
           <w:trHeight w:val="558" w:hRule="atLeast"/>
         </w:trPr>
@@ -13785,14 +12887,6 @@
         </w:tc>
       </w:tr>
       <w:tr>
-        <w:tblPrEx>
-          <w:tblCellMar>
-            <w:top w:w="0" w:type="dxa"/>
-            <w:left w:w="108" w:type="dxa"/>
-            <w:bottom w:w="0" w:type="dxa"/>
-            <w:right w:w="108" w:type="dxa"/>
-          </w:tblCellMar>
-        </w:tblPrEx>
         <w:trPr>
           <w:trHeight w:val="558" w:hRule="atLeast"/>
         </w:trPr>
@@ -14061,14 +13155,6 @@
         </w:tc>
       </w:tr>
       <w:tr>
-        <w:tblPrEx>
-          <w:tblCellMar>
-            <w:top w:w="0" w:type="dxa"/>
-            <w:left w:w="108" w:type="dxa"/>
-            <w:bottom w:w="0" w:type="dxa"/>
-            <w:right w:w="108" w:type="dxa"/>
-          </w:tblCellMar>
-        </w:tblPrEx>
         <w:trPr>
           <w:trHeight w:val="558" w:hRule="atLeast"/>
         </w:trPr>
@@ -14337,14 +13423,6 @@
         </w:tc>
       </w:tr>
       <w:tr>
-        <w:tblPrEx>
-          <w:tblCellMar>
-            <w:top w:w="0" w:type="dxa"/>
-            <w:left w:w="108" w:type="dxa"/>
-            <w:bottom w:w="0" w:type="dxa"/>
-            <w:right w:w="108" w:type="dxa"/>
-          </w:tblCellMar>
-        </w:tblPrEx>
         <w:trPr>
           <w:trHeight w:val="558" w:hRule="atLeast"/>
         </w:trPr>
@@ -14743,7 +13821,7 @@
             </w14:solidFill>
           </w14:textFill>
         </w:rPr>
-        <w:t>2025/7/5</w:t>
+        <w:t>2026/4/21</w:t>
       </w:r>
       <w:r>
         <w:rPr>

</xml_diff>